<commit_message>
Minor tweaks to W3 and 4
</commit_message>
<xml_diff>
--- a/Workshops/Workshop 3 - LM with continuous predictor/W3.docx
+++ b/Workshops/Workshop 3 - LM with continuous predictor/W3.docx
@@ -95,7 +95,7 @@
         <w:t xml:space="preserve"> </w:t>
       </w:r>
       <w:r>
-        <w:t xml:space="preserve">2024-08-16</w:t>
+        <w:t xml:space="preserve">2024-08-18</w:t>
       </w:r>
     </w:p>
     <w:sdt>
@@ -5731,7 +5731,17 @@
         <w:t xml:space="preserve"> </w:t>
       </w:r>
       <w:r>
-        <w:t xml:space="preserve">dataset on MyAberdeen. This data comes from a lab experiment from researchers who were interested in understanding how temperature impacts fecundity in BBB beetles (BBB BBB), ultimately attempting to understanding how the species may respond to climate change.</w:t>
+        <w:t xml:space="preserve">dataset on MyAberdeen. This data comes from a lab experiment from researchers who were interested in understanding how temperature impacts fecundity in burying beetles beetles (</w:t>
+      </w:r>
+      <w:r>
+        <w:rPr>
+          <w:iCs/>
+          <w:i/>
+        </w:rPr>
+        <w:t xml:space="preserve">Nicrophorus vespilloides</w:t>
+      </w:r>
+      <w:r>
+        <w:t xml:space="preserve">), ultimately attempting to understanding how short term (i.e. 6 hours) exposures to temperature changes may affect how the species may respond to climate change.</w:t>
       </w:r>
     </w:p>
     <w:p>

</xml_diff>